<commit_message>
edited p-test 2 of 5th
</commit_message>
<xml_diff>
--- a/25-26/5th grade/exam1/exam1 5th.docx
+++ b/25-26/5th grade/exam1/exam1 5th.docx
@@ -526,7 +526,7 @@
           <w:szCs w:val="28"/>
           <w:u w:val="single"/>
         </w:rPr>
-        <w:t>Write True (T) or False (F)</w:t>
+        <w:t>Answer the following questions</w:t>
       </w:r>
       <w:r>
         <w:rPr>
@@ -578,7 +578,35 @@
           <w:sz w:val="28"/>
           <w:szCs w:val="28"/>
         </w:rPr>
-        <w:t>How old is the mother?..................................................................</w:t>
+        <w:t>How old is the</w:t>
+      </w:r>
+      <w:r>
+        <w:rPr>
+          <w:sz w:val="28"/>
+          <w:szCs w:val="28"/>
+        </w:rPr>
+        <w:t xml:space="preserve"> she</w:t>
+      </w:r>
+      <w:r>
+        <w:rPr>
+          <w:sz w:val="28"/>
+          <w:szCs w:val="28"/>
+        </w:rPr>
+        <w:t>?.</w:t>
+      </w:r>
+      <w:r>
+        <w:rPr>
+          <w:sz w:val="28"/>
+          <w:szCs w:val="28"/>
+        </w:rPr>
+        <w:t>......</w:t>
+      </w:r>
+      <w:r>
+        <w:rPr>
+          <w:sz w:val="28"/>
+          <w:szCs w:val="28"/>
+        </w:rPr>
+        <w:t>.................................................................</w:t>
       </w:r>
       <w:r>
         <w:rPr>
@@ -879,6 +907,13 @@
           <w:szCs w:val="28"/>
         </w:rPr>
         <w:t xml:space="preserve"> uncle</w:t>
+      </w:r>
+      <w:r>
+        <w:rPr>
+          <w:sz w:val="28"/>
+          <w:szCs w:val="28"/>
+        </w:rPr>
+        <w:t>.</w:t>
       </w:r>
     </w:p>
     <w:p>
@@ -1805,7 +1840,6 @@
         <w:rPr>
           <w:sz w:val="28"/>
           <w:szCs w:val="28"/>
-          <w:u w:val="single"/>
         </w:rPr>
         <w:t>(</w:t>
       </w:r>
@@ -1822,7 +1856,21 @@
           <w:sz w:val="28"/>
           <w:szCs w:val="28"/>
         </w:rPr>
-        <w:t>, In the morning, breakfast, In the evening, early )</w:t>
+        <w:t xml:space="preserve">, In the morning, breakfast, In the evening, </w:t>
+      </w:r>
+      <w:r>
+        <w:rPr>
+          <w:sz w:val="28"/>
+          <w:szCs w:val="28"/>
+        </w:rPr>
+        <w:t>get up</w:t>
+      </w:r>
+      <w:r>
+        <w:rPr>
+          <w:sz w:val="28"/>
+          <w:szCs w:val="28"/>
+        </w:rPr>
+        <w:t xml:space="preserve"> )</w:t>
       </w:r>
     </w:p>
     <w:p>

</xml_diff>